<commit_message>
fix: pitpo lab5 report added pages numeration
</commit_message>
<xml_diff>
--- a/Проектирование и тестирование программного обеспечения/отчёт.docx
+++ b/Проектирование и тестирование программного обеспечения/отчёт.docx
@@ -230,17 +230,7 @@
           <w:sz w:val="28"/>
           <w:szCs w:val="28"/>
         </w:rPr>
-        <w:t xml:space="preserve">по лабораторной работе № </w:t>
-      </w:r>
-      <w:r>
-        <w:rPr>
-          <w:rFonts w:cs="Times New Roman" w:ascii="Times New Roman" w:hAnsi="Times New Roman"/>
-          <w:b/>
-          <w:bCs/>
-          <w:sz w:val="28"/>
-          <w:szCs w:val="28"/>
-        </w:rPr>
-        <w:t>5</w:t>
+        <w:t>по лабораторной работе № 5</w:t>
       </w:r>
     </w:p>
     <w:p>
@@ -259,23 +249,7 @@
           <w:sz w:val="28"/>
           <w:szCs w:val="28"/>
         </w:rPr>
-        <w:t>дисциплина «</w:t>
-      </w:r>
-      <w:r>
-        <w:rPr>
-          <w:rFonts w:cs="Times New Roman" w:ascii="Times New Roman" w:hAnsi="Times New Roman"/>
-          <w:sz w:val="28"/>
-          <w:szCs w:val="28"/>
-        </w:rPr>
-        <w:t>Проектирование и тестирование программного обеспечения</w:t>
-      </w:r>
-      <w:r>
-        <w:rPr>
-          <w:rFonts w:cs="Times New Roman" w:ascii="Times New Roman" w:hAnsi="Times New Roman"/>
-          <w:sz w:val="28"/>
-          <w:szCs w:val="28"/>
-        </w:rPr>
-        <w:t>»</w:t>
+        <w:t>дисциплина «Проектирование и тестирование программного обеспечения»</w:t>
       </w:r>
     </w:p>
     <w:p>
@@ -421,7 +395,7 @@
           <w:tab w:val="clear" w:pos="720"/>
           <w:tab w:val="left" w:pos="6650" w:leader="none"/>
         </w:tabs>
-        <w:jc w:val="right"/>
+        <w:jc w:val="end"/>
         <w:rPr>
           <w:rFonts w:ascii="Times New Roman" w:hAnsi="Times New Roman" w:cs="Times New Roman"/>
           <w:sz w:val="28"/>
@@ -444,7 +418,7 @@
           <w:tab w:val="clear" w:pos="720"/>
           <w:tab w:val="left" w:pos="6650" w:leader="none"/>
         </w:tabs>
-        <w:jc w:val="right"/>
+        <w:jc w:val="end"/>
         <w:rPr>
           <w:rFonts w:ascii="Times New Roman" w:hAnsi="Times New Roman" w:cs="Times New Roman"/>
           <w:sz w:val="28"/>
@@ -463,31 +437,31 @@
       <w:tblPr>
         <w:tblStyle w:val="a8"/>
         <w:tblW w:w="5100" w:type="dxa"/>
-        <w:jc w:val="left"/>
+        <w:jc w:val="start"/>
         <w:tblInd w:w="4389" w:type="dxa"/>
         <w:tblLayout w:type="fixed"/>
         <w:tblCellMar>
           <w:top w:w="0" w:type="dxa"/>
-          <w:left w:w="108" w:type="dxa"/>
+          <w:start w:w="108" w:type="dxa"/>
           <w:bottom w:w="0" w:type="dxa"/>
-          <w:right w:w="108" w:type="dxa"/>
+          <w:end w:w="108" w:type="dxa"/>
         </w:tblCellMar>
         <w:tblLook w:noHBand="0" w:noVBand="1" w:firstColumn="1" w:lastRow="0" w:lastColumn="0" w:firstRow="1" w:val="04a0"/>
       </w:tblPr>
       <w:tblGrid>
-        <w:gridCol w:w="2036"/>
-        <w:gridCol w:w="3064"/>
+        <w:gridCol w:w="2035"/>
+        <w:gridCol w:w="3065"/>
       </w:tblGrid>
       <w:tr>
         <w:trPr/>
         <w:tc>
           <w:tcPr>
-            <w:tcW w:w="2036" w:type="dxa"/>
+            <w:tcW w:w="2035" w:type="dxa"/>
             <w:tcBorders>
               <w:top w:val="nil"/>
-              <w:left w:val="nil"/>
+              <w:start w:val="nil"/>
               <w:bottom w:val="nil"/>
-              <w:right w:val="nil"/>
+              <w:end w:val="nil"/>
             </w:tcBorders>
             <w:shd w:color="auto" w:fill="auto" w:val="clear"/>
           </w:tcPr>
@@ -501,7 +475,7 @@
               </w:tabs>
               <w:suppressAutoHyphens w:val="true"/>
               <w:spacing w:lineRule="auto" w:line="240" w:before="0" w:after="0"/>
-              <w:jc w:val="left"/>
+              <w:jc w:val="start"/>
               <w:rPr>
                 <w:rFonts w:ascii="Times New Roman" w:hAnsi="Times New Roman" w:cs="Times New Roman"/>
                 <w:sz w:val="28"/>
@@ -522,12 +496,12 @@
         </w:tc>
         <w:tc>
           <w:tcPr>
-            <w:tcW w:w="3064" w:type="dxa"/>
+            <w:tcW w:w="3065" w:type="dxa"/>
             <w:tcBorders>
               <w:top w:val="nil"/>
-              <w:left w:val="nil"/>
+              <w:start w:val="nil"/>
               <w:bottom w:val="nil"/>
-              <w:right w:val="nil"/>
+              <w:end w:val="nil"/>
             </w:tcBorders>
             <w:shd w:color="auto" w:fill="auto" w:val="clear"/>
           </w:tcPr>
@@ -541,7 +515,7 @@
               </w:tabs>
               <w:suppressAutoHyphens w:val="true"/>
               <w:spacing w:lineRule="auto" w:line="240" w:before="0" w:after="0"/>
-              <w:jc w:val="left"/>
+              <w:jc w:val="start"/>
               <w:rPr>
                 <w:rFonts w:ascii="Times New Roman" w:hAnsi="Times New Roman" w:cs="Times New Roman"/>
                 <w:sz w:val="28"/>
@@ -565,12 +539,12 @@
         <w:trPr/>
         <w:tc>
           <w:tcPr>
-            <w:tcW w:w="2036" w:type="dxa"/>
+            <w:tcW w:w="2035" w:type="dxa"/>
             <w:tcBorders>
               <w:top w:val="nil"/>
-              <w:left w:val="nil"/>
+              <w:start w:val="nil"/>
               <w:bottom w:val="nil"/>
-              <w:right w:val="nil"/>
+              <w:end w:val="nil"/>
             </w:tcBorders>
             <w:shd w:color="auto" w:fill="auto" w:val="clear"/>
           </w:tcPr>
@@ -584,7 +558,7 @@
               </w:tabs>
               <w:suppressAutoHyphens w:val="true"/>
               <w:spacing w:lineRule="auto" w:line="240" w:before="0" w:after="0"/>
-              <w:jc w:val="right"/>
+              <w:jc w:val="end"/>
               <w:rPr>
                 <w:rFonts w:ascii="Times New Roman" w:hAnsi="Times New Roman" w:cs="Times New Roman"/>
                 <w:sz w:val="28"/>
@@ -593,23 +567,21 @@
             </w:pPr>
             <w:r>
               <w:rPr>
-                <w:rFonts w:eastAsia="Calibri" w:cs="Times New Roman" w:ascii="Times New Roman" w:hAnsi="Times New Roman"/>
-                <w:kern w:val="0"/>
+                <w:rFonts w:cs="Times New Roman" w:ascii="Times New Roman" w:hAnsi="Times New Roman"/>
                 <w:sz w:val="28"/>
                 <w:szCs w:val="28"/>
-                <w:lang w:val="ru-RU" w:eastAsia="en-US" w:bidi="ar-SA"/>
               </w:rPr>
             </w:r>
           </w:p>
         </w:tc>
         <w:tc>
           <w:tcPr>
-            <w:tcW w:w="3064" w:type="dxa"/>
+            <w:tcW w:w="3065" w:type="dxa"/>
             <w:tcBorders>
               <w:top w:val="nil"/>
-              <w:left w:val="nil"/>
+              <w:start w:val="nil"/>
               <w:bottom w:val="nil"/>
-              <w:right w:val="nil"/>
+              <w:end w:val="nil"/>
             </w:tcBorders>
             <w:shd w:color="auto" w:fill="auto" w:val="clear"/>
           </w:tcPr>
@@ -623,7 +595,7 @@
               </w:tabs>
               <w:suppressAutoHyphens w:val="true"/>
               <w:spacing w:lineRule="auto" w:line="240" w:before="0" w:after="0"/>
-              <w:jc w:val="left"/>
+              <w:jc w:val="start"/>
               <w:rPr>
                 <w:rFonts w:ascii="Times New Roman" w:hAnsi="Times New Roman" w:cs="Times New Roman"/>
                 <w:sz w:val="28"/>
@@ -649,12 +621,12 @@
         </w:trPr>
         <w:tc>
           <w:tcPr>
-            <w:tcW w:w="2036" w:type="dxa"/>
+            <w:tcW w:w="2035" w:type="dxa"/>
             <w:tcBorders>
               <w:top w:val="nil"/>
-              <w:left w:val="nil"/>
+              <w:start w:val="nil"/>
               <w:bottom w:val="nil"/>
-              <w:right w:val="nil"/>
+              <w:end w:val="nil"/>
             </w:tcBorders>
             <w:shd w:color="auto" w:fill="auto" w:val="clear"/>
           </w:tcPr>
@@ -668,7 +640,7 @@
               </w:tabs>
               <w:suppressAutoHyphens w:val="true"/>
               <w:spacing w:lineRule="auto" w:line="240" w:before="0" w:after="0"/>
-              <w:jc w:val="left"/>
+              <w:jc w:val="start"/>
               <w:rPr>
                 <w:rFonts w:ascii="Times New Roman" w:hAnsi="Times New Roman" w:cs="Times New Roman"/>
                 <w:sz w:val="28"/>
@@ -689,12 +661,12 @@
         </w:tc>
         <w:tc>
           <w:tcPr>
-            <w:tcW w:w="3064" w:type="dxa"/>
+            <w:tcW w:w="3065" w:type="dxa"/>
             <w:tcBorders>
               <w:top w:val="nil"/>
-              <w:left w:val="nil"/>
+              <w:start w:val="nil"/>
               <w:bottom w:val="nil"/>
-              <w:right w:val="nil"/>
+              <w:end w:val="nil"/>
             </w:tcBorders>
             <w:shd w:color="auto" w:fill="auto" w:val="clear"/>
           </w:tcPr>
@@ -708,7 +680,7 @@
               </w:tabs>
               <w:suppressAutoHyphens w:val="true"/>
               <w:spacing w:lineRule="auto" w:line="240" w:before="0" w:after="0"/>
-              <w:jc w:val="left"/>
+              <w:jc w:val="start"/>
               <w:rPr>
                 <w:rFonts w:ascii="Times New Roman" w:hAnsi="Times New Roman" w:cs="Times New Roman"/>
                 <w:sz w:val="28"/>
@@ -723,17 +695,7 @@
                 <w:szCs w:val="28"/>
                 <w:lang w:val="ru-RU" w:eastAsia="en-US" w:bidi="ar-SA"/>
               </w:rPr>
-              <w:t xml:space="preserve">асс. </w:t>
-            </w:r>
-            <w:r>
-              <w:rPr>
-                <w:rFonts w:eastAsia="Calibri" w:cs="Times New Roman" w:ascii="Times New Roman" w:hAnsi="Times New Roman"/>
-                <w:kern w:val="0"/>
-                <w:sz w:val="28"/>
-                <w:szCs w:val="28"/>
-                <w:lang w:val="ru-RU" w:eastAsia="en-US" w:bidi="ar-SA"/>
-              </w:rPr>
-              <w:t>Симоненко А.Е.</w:t>
+              <w:t>асс. Симоненко А.Е.</w:t>
             </w:r>
           </w:p>
         </w:tc>
@@ -747,7 +709,7 @@
           <w:tab w:val="left" w:pos="6650" w:leader="none"/>
         </w:tabs>
         <w:spacing w:before="0" w:after="0"/>
-        <w:jc w:val="right"/>
+        <w:jc w:val="end"/>
         <w:rPr>
           <w:rFonts w:ascii="Times New Roman" w:hAnsi="Times New Roman" w:cs="Times New Roman"/>
           <w:sz w:val="28"/>
@@ -841,25 +803,22 @@
           <w:sz w:val="28"/>
           <w:szCs w:val="28"/>
         </w:rPr>
-      </w:pPr>
-      <w:r>
-        <w:rPr>
-          <w:rFonts w:cs="Times New Roman" w:ascii="Times New Roman" w:hAnsi="Times New Roman"/>
-          <w:sz w:val="28"/>
-          <w:szCs w:val="28"/>
-        </w:rPr>
-        <w:t>Омск 202</w:t>
-      </w:r>
-      <w:r>
-        <w:rPr>
-          <w:rFonts w:cs="Times New Roman" w:ascii="Times New Roman" w:hAnsi="Times New Roman"/>
-          <w:sz w:val="28"/>
-          <w:szCs w:val="28"/>
-        </w:rPr>
-        <w:t>6</w:t>
-      </w:r>
-      <w:r>
-        <w:br w:type="page"/>
+        <w:sectPr>
+          <w:type w:val="nextPage"/>
+          <w:pgSz w:w="11906" w:h="16838"/>
+          <w:pgMar w:left="1134" w:right="1134" w:gutter="0" w:header="0" w:top="1134" w:footer="0" w:bottom="1134"/>
+          <w:pgNumType w:fmt="decimal"/>
+          <w:formProt w:val="false"/>
+          <w:textDirection w:val="lrTb"/>
+        </w:sectPr>
+      </w:pPr>
+      <w:r>
+        <w:rPr>
+          <w:rFonts w:cs="Times New Roman" w:ascii="Times New Roman" w:hAnsi="Times New Roman"/>
+          <w:sz w:val="28"/>
+          <w:szCs w:val="28"/>
+        </w:rPr>
+        <w:t>Омск 2026</w:t>
       </w:r>
     </w:p>
     <w:p>
@@ -1100,58 +1059,64 @@
         </w:tabs>
         <w:spacing w:lineRule="auto" w:line="300" w:before="0" w:after="0"/>
         <w:ind w:firstLine="567"/>
-        <w:jc w:val="left"/>
-        <w:rPr>
-          <w:rFonts w:ascii="Times New Roman" w:hAnsi="Times New Roman" w:cs="Times New Roman"/>
-          <w:sz w:val="28"/>
-          <w:szCs w:val="28"/>
-        </w:rPr>
-      </w:pPr>
-      <w:r>
-        <w:rPr>
-          <w:rFonts w:cs="Times New Roman" w:ascii="Times New Roman" w:hAnsi="Times New Roman"/>
-          <w:sz w:val="28"/>
-          <w:szCs w:val="28"/>
-        </w:rPr>
-      </w:r>
-      <w:r>
-        <w:br w:type="page"/>
-      </w:r>
-      <w:r>
+        <w:jc w:val="start"/>
+        <w:rPr>
+          <w:rFonts w:ascii="Times New Roman" w:hAnsi="Times New Roman" w:cs="Times New Roman"/>
+          <w:sz w:val="28"/>
+          <w:szCs w:val="28"/>
+        </w:rPr>
+      </w:pPr>
+      <w:r>
+        <w:rPr>
+          <w:rFonts w:cs="Times New Roman" w:ascii="Times New Roman" w:hAnsi="Times New Roman"/>
+          <w:sz w:val="28"/>
+          <w:szCs w:val="28"/>
+        </w:rPr>
         <mc:AlternateContent>
           <mc:Choice Requires="wps">
             <w:drawing>
               <wp:anchor distT="0" distB="0" distL="0" distR="0" simplePos="0" relativeHeight="2" behindDoc="0" locked="0" layoutInCell="0" allowOverlap="1">
                 <wp:simplePos x="0" y="0"/>
                 <wp:positionH relativeFrom="column">
-                  <wp:posOffset>1390650</wp:posOffset>
+                  <wp:posOffset>1572260</wp:posOffset>
                 </wp:positionH>
                 <wp:positionV relativeFrom="paragraph">
-                  <wp:posOffset>6350</wp:posOffset>
+                  <wp:posOffset>41275</wp:posOffset>
                 </wp:positionV>
-                <wp:extent cx="3519170" cy="8511540"/>
+                <wp:extent cx="3155315" cy="7833360"/>
                 <wp:effectExtent l="0" t="0" r="0" b="0"/>
                 <wp:wrapTopAndBottom/>
                 <wp:docPr id="1" name="Врезка1"/>
                 <a:graphic xmlns:a="http://schemas.openxmlformats.org/drawingml/2006/main">
                   <a:graphicData uri="http://schemas.microsoft.com/office/word/2010/wordprocessingShape">
                     <wps:wsp>
-                      <wps:cNvSpPr txBox="1"/>
+                      <wps:cNvSpPr/>
                       <wps:spPr>
                         <a:xfrm>
                           <a:off x="0" y="0"/>
-                          <a:ext cx="3519170" cy="8511540"/>
+                          <a:ext cx="3155400" cy="7833240"/>
                         </a:xfrm>
-                        <a:prstGeom prst="rect"/>
+                        <a:prstGeom prst="rect">
+                          <a:avLst/>
+                        </a:prstGeom>
                         <a:solidFill>
                           <a:srgbClr val="FFFFFF"/>
                         </a:solidFill>
+                        <a:ln w="0">
+                          <a:noFill/>
+                        </a:ln>
                       </wps:spPr>
+                      <wps:style>
+                        <a:lnRef idx="0"/>
+                        <a:fillRef idx="0"/>
+                        <a:effectRef idx="0"/>
+                        <a:fontRef idx="minor"/>
+                      </wps:style>
                       <wps:txbx>
                         <w:txbxContent>
                           <w:p>
                             <w:pPr>
-                              <w:pStyle w:val="Style18"/>
+                              <w:pStyle w:val="user3"/>
                               <w:spacing w:before="0" w:after="200"/>
                               <w:jc w:val="center"/>
                               <w:rPr>
@@ -1164,17 +1129,10 @@
                               </w:rPr>
                             </w:pPr>
                             <w:r>
-                              <w:rPr>
-                                <w:rFonts w:ascii="Times New Roman" w:hAnsi="Times New Roman"/>
-                                <w:i w:val="false"/>
-                                <w:iCs w:val="false"/>
-                                <w:color w:val="000000"/>
-                                <w:sz w:val="28"/>
-                                <w:szCs w:val="28"/>
-                              </w:rPr>
+                              <w:rPr/>
                               <w:drawing>
                                 <wp:inline distT="0" distB="0" distL="0" distR="0">
-                                  <wp:extent cx="3378200" cy="8170545"/>
+                                  <wp:extent cx="3069590" cy="7423785"/>
                                   <wp:effectExtent l="0" t="0" r="0" b="0"/>
                                   <wp:docPr id="2" name="Изображение1"/>
                                   <wp:cNvGraphicFramePr>
@@ -1198,7 +1156,7 @@
                                         <pic:spPr bwMode="auto">
                                           <a:xfrm>
                                             <a:off x="0" y="0"/>
-                                            <a:ext cx="3378200" cy="8170545"/>
+                                            <a:ext cx="3069590" cy="7423785"/>
                                           </a:xfrm>
                                           <a:prstGeom prst="rect">
                                             <a:avLst/>
@@ -1210,6 +1168,16 @@
                                   </a:graphic>
                                 </wp:inline>
                               </w:drawing>
+                            </w:r>
+                            <w:r>
+                              <w:rPr>
+                                <w:rFonts w:ascii="Times New Roman" w:hAnsi="Times New Roman"/>
+                                <w:i w:val="false"/>
+                                <w:iCs w:val="false"/>
+                                <w:color w:val="000000"/>
+                                <w:sz w:val="28"/>
+                                <w:szCs w:val="28"/>
+                              </w:rPr>
                               <w:t xml:space="preserve">Рисунок </w:t>
                             </w:r>
                             <w:r>
@@ -1281,7 +1249,7 @@
                           </w:p>
                         </w:txbxContent>
                       </wps:txbx>
-                      <wps:bodyPr anchor="t" lIns="0" tIns="0" rIns="0" bIns="0">
+                      <wps:bodyPr lIns="0" tIns="0" rIns="0" bIns="0" anchor="t">
                         <a:noAutofit/>
                       </wps:bodyPr>
                     </wps:wsp>
@@ -1292,12 +1260,14 @@
           </mc:Choice>
           <mc:Fallback>
             <w:pict>
-              <v:rect style="position:absolute;rotation:-0;width:277.1pt;height:670.2pt;mso-wrap-distance-left:0pt;mso-wrap-distance-right:0pt;mso-wrap-distance-top:0pt;mso-wrap-distance-bottom:0pt;margin-top:0.5pt;mso-position-vertical-relative:text;margin-left:109.5pt;mso-position-horizontal-relative:text">
-                <v:textbox inset="0in,0in,0in,0in">
+              <v:rect id="shape_0" fillcolor="white" stroked="f" o:allowincell="f" style="position:absolute;margin-left:123.8pt;margin-top:3.25pt;width:248.4pt;height:616.75pt;mso-wrap-style:square;v-text-anchor:top">
+                <v:fill o:detectmouseclick="t" type="solid" color2="black"/>
+                <v:stroke color="#3465a4" joinstyle="round" endcap="flat"/>
+                <v:textbox>
                   <w:txbxContent>
                     <w:p>
                       <w:pPr>
-                        <w:pStyle w:val="Style18"/>
+                        <w:pStyle w:val="user3"/>
                         <w:spacing w:before="0" w:after="200"/>
                         <w:jc w:val="center"/>
                         <w:rPr>
@@ -1310,17 +1280,10 @@
                         </w:rPr>
                       </w:pPr>
                       <w:r>
-                        <w:rPr>
-                          <w:rFonts w:ascii="Times New Roman" w:hAnsi="Times New Roman"/>
-                          <w:i w:val="false"/>
-                          <w:iCs w:val="false"/>
-                          <w:color w:val="000000"/>
-                          <w:sz w:val="28"/>
-                          <w:szCs w:val="28"/>
-                        </w:rPr>
+                        <w:rPr/>
                         <w:drawing>
                           <wp:inline distT="0" distB="0" distL="0" distR="0">
-                            <wp:extent cx="3378200" cy="8170545"/>
+                            <wp:extent cx="3069590" cy="7423785"/>
                             <wp:effectExtent l="0" t="0" r="0" b="0"/>
                             <wp:docPr id="3" name="Изображение1"/>
                             <wp:cNvGraphicFramePr>
@@ -1344,7 +1307,7 @@
                                   <pic:spPr bwMode="auto">
                                     <a:xfrm>
                                       <a:off x="0" y="0"/>
-                                      <a:ext cx="3378200" cy="8170545"/>
+                                      <a:ext cx="3069590" cy="7423785"/>
                                     </a:xfrm>
                                     <a:prstGeom prst="rect">
                                       <a:avLst/>
@@ -1356,6 +1319,16 @@
                             </a:graphic>
                           </wp:inline>
                         </w:drawing>
+                      </w:r>
+                      <w:r>
+                        <w:rPr>
+                          <w:rFonts w:ascii="Times New Roman" w:hAnsi="Times New Roman"/>
+                          <w:i w:val="false"/>
+                          <w:iCs w:val="false"/>
+                          <w:color w:val="000000"/>
+                          <w:sz w:val="28"/>
+                          <w:szCs w:val="28"/>
+                        </w:rPr>
                         <w:t xml:space="preserve">Рисунок </w:t>
                       </w:r>
                       <w:r>
@@ -1433,6 +1406,18 @@
           </mc:Fallback>
         </mc:AlternateContent>
       </w:r>
+      <w:r>
+        <w:br w:type="page"/>
+      </w:r>
+    </w:p>
+    <w:p>
+      <w:pPr>
+        <w:pStyle w:val="Normal"/>
+        <w:rPr/>
+      </w:pPr>
+      <w:r>
+        <w:rPr/>
+      </w:r>
     </w:p>
     <w:p>
       <w:pPr>
@@ -3650,8 +3635,6 @@
           <w:sz w:val="28"/>
           <w:szCs w:val="28"/>
         </w:rPr>
-      </w:r>
-      <w:r>
         <mc:AlternateContent>
           <mc:Choice Requires="wps">
             <w:drawing>
@@ -3670,22 +3653,33 @@
                 <a:graphic xmlns:a="http://schemas.openxmlformats.org/drawingml/2006/main">
                   <a:graphicData uri="http://schemas.microsoft.com/office/word/2010/wordprocessingShape">
                     <wps:wsp>
-                      <wps:cNvSpPr txBox="1"/>
+                      <wps:cNvSpPr/>
                       <wps:spPr>
                         <a:xfrm>
                           <a:off x="0" y="0"/>
-                          <a:ext cx="5634355" cy="2320290"/>
+                          <a:ext cx="5634360" cy="2320200"/>
                         </a:xfrm>
-                        <a:prstGeom prst="rect"/>
+                        <a:prstGeom prst="rect">
+                          <a:avLst/>
+                        </a:prstGeom>
                         <a:solidFill>
                           <a:srgbClr val="FFFFFF"/>
                         </a:solidFill>
+                        <a:ln w="0">
+                          <a:noFill/>
+                        </a:ln>
                       </wps:spPr>
+                      <wps:style>
+                        <a:lnRef idx="0"/>
+                        <a:fillRef idx="0"/>
+                        <a:effectRef idx="0"/>
+                        <a:fontRef idx="minor"/>
+                      </wps:style>
                       <wps:txbx>
                         <w:txbxContent>
                           <w:p>
                             <w:pPr>
-                              <w:pStyle w:val="Style18"/>
+                              <w:pStyle w:val="user3"/>
                               <w:spacing w:before="0" w:after="200"/>
                               <w:jc w:val="center"/>
                               <w:rPr>
@@ -3698,14 +3692,7 @@
                               </w:rPr>
                             </w:pPr>
                             <w:r>
-                              <w:rPr>
-                                <w:rFonts w:ascii="Times New Roman" w:hAnsi="Times New Roman"/>
-                                <w:i w:val="false"/>
-                                <w:iCs w:val="false"/>
-                                <w:color w:val="000000"/>
-                                <w:sz w:val="28"/>
-                                <w:szCs w:val="28"/>
-                              </w:rPr>
+                              <w:rPr/>
                               <w:drawing>
                                 <wp:inline distT="0" distB="0" distL="0" distR="0">
                                   <wp:extent cx="5634355" cy="2115820"/>
@@ -3744,6 +3731,16 @@
                                   </a:graphic>
                                 </wp:inline>
                               </w:drawing>
+                            </w:r>
+                            <w:r>
+                              <w:rPr>
+                                <w:rFonts w:ascii="Times New Roman" w:hAnsi="Times New Roman"/>
+                                <w:i w:val="false"/>
+                                <w:iCs w:val="false"/>
+                                <w:color w:val="000000"/>
+                                <w:sz w:val="28"/>
+                                <w:szCs w:val="28"/>
+                              </w:rPr>
                               <w:t xml:space="preserve">Рисунок </w:t>
                             </w:r>
                             <w:r>
@@ -3815,7 +3812,7 @@
                           </w:p>
                         </w:txbxContent>
                       </wps:txbx>
-                      <wps:bodyPr anchor="t" lIns="0" tIns="0" rIns="0" bIns="0">
+                      <wps:bodyPr lIns="0" tIns="0" rIns="0" bIns="0" anchor="t">
                         <a:noAutofit/>
                       </wps:bodyPr>
                     </wps:wsp>
@@ -3826,12 +3823,14 @@
           </mc:Choice>
           <mc:Fallback>
             <w:pict>
-              <v:rect style="position:absolute;rotation:-0;width:443.65pt;height:182.7pt;mso-wrap-distance-left:0pt;mso-wrap-distance-right:0pt;mso-wrap-distance-top:0pt;mso-wrap-distance-bottom:0pt;margin-top:0pt;mso-position-vertical:top;mso-position-vertical-relative:text;margin-left:26.25pt;mso-position-horizontal:center;mso-position-horizontal-relative:text">
-                <v:textbox inset="0in,0in,0in,0in">
+              <v:rect id="shape_0" fillcolor="white" stroked="f" o:allowincell="f" style="position:absolute;margin-left:26.2pt;margin-top:0.05pt;width:443.6pt;height:182.65pt;mso-wrap-style:square;v-text-anchor:top;mso-position-horizontal:center">
+                <v:fill o:detectmouseclick="t" type="solid" color2="black"/>
+                <v:stroke color="#3465a4" joinstyle="round" endcap="flat"/>
+                <v:textbox>
                   <w:txbxContent>
                     <w:p>
                       <w:pPr>
-                        <w:pStyle w:val="Style18"/>
+                        <w:pStyle w:val="user3"/>
                         <w:spacing w:before="0" w:after="200"/>
                         <w:jc w:val="center"/>
                         <w:rPr>
@@ -3844,14 +3843,7 @@
                         </w:rPr>
                       </w:pPr>
                       <w:r>
-                        <w:rPr>
-                          <w:rFonts w:ascii="Times New Roman" w:hAnsi="Times New Roman"/>
-                          <w:i w:val="false"/>
-                          <w:iCs w:val="false"/>
-                          <w:color w:val="000000"/>
-                          <w:sz w:val="28"/>
-                          <w:szCs w:val="28"/>
-                        </w:rPr>
+                        <w:rPr/>
                         <w:drawing>
                           <wp:inline distT="0" distB="0" distL="0" distR="0">
                             <wp:extent cx="5634355" cy="2115820"/>
@@ -3890,6 +3882,16 @@
                             </a:graphic>
                           </wp:inline>
                         </w:drawing>
+                      </w:r>
+                      <w:r>
+                        <w:rPr>
+                          <w:rFonts w:ascii="Times New Roman" w:hAnsi="Times New Roman"/>
+                          <w:i w:val="false"/>
+                          <w:iCs w:val="false"/>
+                          <w:color w:val="000000"/>
+                          <w:sz w:val="28"/>
+                          <w:szCs w:val="28"/>
+                        </w:rPr>
                         <w:t xml:space="preserve">Рисунок </w:t>
                       </w:r>
                       <w:r>
@@ -4246,30 +4248,6 @@
         </w:rPr>
         <w:t>Если задачи набрать можно, выведите еще nk строк так, чтобы i-я строка содержала номера задач, которые могут быть включены в категорию i. Номера задач должны быть положительными целыми числами, не превышающими np, и два последовательных номера должны быть разделены одним пробелом. Подойдет любая правильная выборка задач.</w:t>
       </w:r>
-    </w:p>
-    <w:p>
-      <w:pPr>
-        <w:pStyle w:val="Normal"/>
-        <w:tabs>
-          <w:tab w:val="clear" w:pos="720"/>
-          <w:tab w:val="left" w:pos="4050" w:leader="none"/>
-        </w:tabs>
-        <w:spacing w:lineRule="auto" w:line="300" w:before="0" w:after="0"/>
-        <w:ind w:firstLine="567"/>
-        <w:jc w:val="both"/>
-        <w:rPr>
-          <w:rFonts w:ascii="Times New Roman" w:hAnsi="Times New Roman" w:cs="Times New Roman"/>
-          <w:sz w:val="28"/>
-          <w:szCs w:val="28"/>
-        </w:rPr>
-      </w:pPr>
-      <w:r>
-        <w:rPr>
-          <w:rFonts w:cs="Times New Roman" w:ascii="Times New Roman" w:hAnsi="Times New Roman"/>
-          <w:sz w:val="28"/>
-          <w:szCs w:val="28"/>
-        </w:rPr>
-      </w:r>
       <w:r>
         <w:br w:type="page"/>
       </w:r>
@@ -4321,8 +4299,6 @@
           <w:sz w:val="28"/>
           <w:szCs w:val="28"/>
         </w:rPr>
-      </w:r>
-      <w:r>
         <mc:AlternateContent>
           <mc:Choice Requires="wps">
             <w:drawing>
@@ -4341,22 +4317,33 @@
                 <a:graphic xmlns:a="http://schemas.openxmlformats.org/drawingml/2006/main">
                   <a:graphicData uri="http://schemas.microsoft.com/office/word/2010/wordprocessingShape">
                     <wps:wsp>
-                      <wps:cNvSpPr txBox="1"/>
+                      <wps:cNvSpPr/>
                       <wps:spPr>
                         <a:xfrm>
                           <a:off x="0" y="0"/>
-                          <a:ext cx="4203700" cy="7429500"/>
+                          <a:ext cx="4203720" cy="7429680"/>
                         </a:xfrm>
-                        <a:prstGeom prst="rect"/>
+                        <a:prstGeom prst="rect">
+                          <a:avLst/>
+                        </a:prstGeom>
                         <a:solidFill>
                           <a:srgbClr val="FFFFFF"/>
                         </a:solidFill>
+                        <a:ln w="0">
+                          <a:noFill/>
+                        </a:ln>
                       </wps:spPr>
+                      <wps:style>
+                        <a:lnRef idx="0"/>
+                        <a:fillRef idx="0"/>
+                        <a:effectRef idx="0"/>
+                        <a:fontRef idx="minor"/>
+                      </wps:style>
                       <wps:txbx>
                         <w:txbxContent>
                           <w:p>
                             <w:pPr>
-                              <w:pStyle w:val="Style18"/>
+                              <w:pStyle w:val="user3"/>
                               <w:spacing w:before="0" w:after="200"/>
                               <w:jc w:val="center"/>
                               <w:rPr>
@@ -4369,14 +4356,7 @@
                               </w:rPr>
                             </w:pPr>
                             <w:r>
-                              <w:rPr>
-                                <w:rFonts w:ascii="Times New Roman" w:hAnsi="Times New Roman"/>
-                                <w:i w:val="false"/>
-                                <w:iCs w:val="false"/>
-                                <w:color w:val="000000"/>
-                                <w:sz w:val="28"/>
-                                <w:szCs w:val="28"/>
-                              </w:rPr>
+                              <w:rPr/>
                               <w:drawing>
                                 <wp:inline distT="0" distB="0" distL="0" distR="0">
                                   <wp:extent cx="4203700" cy="7225030"/>
@@ -4415,6 +4395,16 @@
                                   </a:graphic>
                                 </wp:inline>
                               </w:drawing>
+                            </w:r>
+                            <w:r>
+                              <w:rPr>
+                                <w:rFonts w:ascii="Times New Roman" w:hAnsi="Times New Roman"/>
+                                <w:i w:val="false"/>
+                                <w:iCs w:val="false"/>
+                                <w:color w:val="000000"/>
+                                <w:sz w:val="28"/>
+                                <w:szCs w:val="28"/>
+                              </w:rPr>
                               <w:t xml:space="preserve">Рисунок </w:t>
                             </w:r>
                             <w:r>
@@ -4486,7 +4476,7 @@
                           </w:p>
                         </w:txbxContent>
                       </wps:txbx>
-                      <wps:bodyPr anchor="t" lIns="0" tIns="0" rIns="0" bIns="0">
+                      <wps:bodyPr lIns="0" tIns="0" rIns="0" bIns="0" anchor="t">
                         <a:noAutofit/>
                       </wps:bodyPr>
                     </wps:wsp>
@@ -4497,12 +4487,14 @@
           </mc:Choice>
           <mc:Fallback>
             <w:pict>
-              <v:rect style="position:absolute;rotation:-0;width:331pt;height:585pt;mso-wrap-distance-left:0pt;mso-wrap-distance-right:0pt;mso-wrap-distance-top:0pt;mso-wrap-distance-bottom:0pt;margin-top:2.55pt;mso-position-vertical-relative:text;margin-left:82.55pt;mso-position-horizontal-relative:text">
-                <v:textbox inset="0in,0in,0in,0in">
+              <v:rect id="shape_0" fillcolor="white" stroked="f" o:allowincell="f" style="position:absolute;margin-left:82.55pt;margin-top:2.55pt;width:330.95pt;height:584.95pt;mso-wrap-style:square;v-text-anchor:top">
+                <v:fill o:detectmouseclick="t" type="solid" color2="black"/>
+                <v:stroke color="#3465a4" joinstyle="round" endcap="flat"/>
+                <v:textbox>
                   <w:txbxContent>
                     <w:p>
                       <w:pPr>
-                        <w:pStyle w:val="Style18"/>
+                        <w:pStyle w:val="user3"/>
                         <w:spacing w:before="0" w:after="200"/>
                         <w:jc w:val="center"/>
                         <w:rPr>
@@ -4515,14 +4507,7 @@
                         </w:rPr>
                       </w:pPr>
                       <w:r>
-                        <w:rPr>
-                          <w:rFonts w:ascii="Times New Roman" w:hAnsi="Times New Roman"/>
-                          <w:i w:val="false"/>
-                          <w:iCs w:val="false"/>
-                          <w:color w:val="000000"/>
-                          <w:sz w:val="28"/>
-                          <w:szCs w:val="28"/>
-                        </w:rPr>
+                        <w:rPr/>
                         <w:drawing>
                           <wp:inline distT="0" distB="0" distL="0" distR="0">
                             <wp:extent cx="4203700" cy="7225030"/>
@@ -4561,6 +4546,16 @@
                             </a:graphic>
                           </wp:inline>
                         </w:drawing>
+                      </w:r>
+                      <w:r>
+                        <w:rPr>
+                          <w:rFonts w:ascii="Times New Roman" w:hAnsi="Times New Roman"/>
+                          <w:i w:val="false"/>
+                          <w:iCs w:val="false"/>
+                          <w:color w:val="000000"/>
+                          <w:sz w:val="28"/>
+                          <w:szCs w:val="28"/>
+                        </w:rPr>
                         <w:t xml:space="preserve">Рисунок </w:t>
                       </w:r>
                       <w:r>
@@ -7232,30 +7227,6 @@
           <w:sz w:val="28"/>
           <w:szCs w:val="28"/>
         </w:rPr>
-      </w:r>
-    </w:p>
-    <w:p>
-      <w:pPr>
-        <w:pStyle w:val="Normal"/>
-        <w:tabs>
-          <w:tab w:val="clear" w:pos="720"/>
-          <w:tab w:val="left" w:pos="4050" w:leader="none"/>
-        </w:tabs>
-        <w:spacing w:lineRule="auto" w:line="300" w:before="0" w:after="0"/>
-        <w:ind w:firstLine="567"/>
-        <w:jc w:val="both"/>
-        <w:rPr>
-          <w:rFonts w:ascii="Times New Roman" w:hAnsi="Times New Roman" w:cs="Times New Roman"/>
-          <w:sz w:val="28"/>
-          <w:szCs w:val="28"/>
-        </w:rPr>
-      </w:pPr>
-      <w:r>
-        <w:rPr>
-          <w:rFonts w:cs="Times New Roman" w:ascii="Times New Roman" w:hAnsi="Times New Roman"/>
-          <w:sz w:val="28"/>
-          <w:szCs w:val="28"/>
-        </w:rPr>
         <w:t>Результат прохождения тестов программой:</w:t>
       </w:r>
     </w:p>
@@ -7281,8 +7252,6 @@
           <w:sz w:val="28"/>
           <w:szCs w:val="28"/>
         </w:rPr>
-      </w:r>
-      <w:r>
         <mc:AlternateContent>
           <mc:Choice Requires="wps">
             <w:drawing>
@@ -7301,22 +7270,33 @@
                 <a:graphic xmlns:a="http://schemas.openxmlformats.org/drawingml/2006/main">
                   <a:graphicData uri="http://schemas.microsoft.com/office/word/2010/wordprocessingShape">
                     <wps:wsp>
-                      <wps:cNvSpPr txBox="1"/>
+                      <wps:cNvSpPr/>
                       <wps:spPr>
                         <a:xfrm>
                           <a:off x="0" y="0"/>
-                          <a:ext cx="5661025" cy="1995805"/>
+                          <a:ext cx="5661000" cy="1995840"/>
                         </a:xfrm>
-                        <a:prstGeom prst="rect"/>
+                        <a:prstGeom prst="rect">
+                          <a:avLst/>
+                        </a:prstGeom>
                         <a:solidFill>
                           <a:srgbClr val="FFFFFF"/>
                         </a:solidFill>
+                        <a:ln w="0">
+                          <a:noFill/>
+                        </a:ln>
                       </wps:spPr>
+                      <wps:style>
+                        <a:lnRef idx="0"/>
+                        <a:fillRef idx="0"/>
+                        <a:effectRef idx="0"/>
+                        <a:fontRef idx="minor"/>
+                      </wps:style>
                       <wps:txbx>
                         <w:txbxContent>
                           <w:p>
                             <w:pPr>
-                              <w:pStyle w:val="Style18"/>
+                              <w:pStyle w:val="user3"/>
                               <w:spacing w:before="0" w:after="200"/>
                               <w:jc w:val="center"/>
                               <w:rPr>
@@ -7328,13 +7308,7 @@
                               </w:rPr>
                             </w:pPr>
                             <w:r>
-                              <w:rPr>
-                                <w:rFonts w:ascii="Times New Roman" w:hAnsi="Times New Roman"/>
-                                <w:i w:val="false"/>
-                                <w:iCs w:val="false"/>
-                                <w:sz w:val="28"/>
-                                <w:szCs w:val="28"/>
-                              </w:rPr>
+                              <w:rPr/>
                               <w:drawing>
                                 <wp:inline distT="0" distB="0" distL="0" distR="0">
                                   <wp:extent cx="5661025" cy="1791335"/>
@@ -7373,6 +7347,15 @@
                                   </a:graphic>
                                 </wp:inline>
                               </w:drawing>
+                            </w:r>
+                            <w:r>
+                              <w:rPr>
+                                <w:rFonts w:ascii="Times New Roman" w:hAnsi="Times New Roman"/>
+                                <w:i w:val="false"/>
+                                <w:iCs w:val="false"/>
+                                <w:sz w:val="28"/>
+                                <w:szCs w:val="28"/>
+                              </w:rPr>
                               <w:t xml:space="preserve">Рисунок </w:t>
                             </w:r>
                             <w:r>
@@ -7438,7 +7421,7 @@
                           </w:p>
                         </w:txbxContent>
                       </wps:txbx>
-                      <wps:bodyPr anchor="t" lIns="0" tIns="0" rIns="0" bIns="0">
+                      <wps:bodyPr lIns="0" tIns="0" rIns="0" bIns="0" anchor="t">
                         <a:noAutofit/>
                       </wps:bodyPr>
                     </wps:wsp>
@@ -7449,12 +7432,14 @@
           </mc:Choice>
           <mc:Fallback>
             <w:pict>
-              <v:rect style="position:absolute;rotation:-0;width:445.75pt;height:157.15pt;mso-wrap-distance-left:0pt;mso-wrap-distance-right:0pt;mso-wrap-distance-top:0pt;mso-wrap-distance-bottom:0pt;margin-top:0pt;mso-position-vertical:top;mso-position-vertical-relative:text;margin-left:25.2pt;mso-position-horizontal:center;mso-position-horizontal-relative:text">
-                <v:textbox inset="0in,0in,0in,0in">
+              <v:rect id="shape_0" fillcolor="white" stroked="f" o:allowincell="f" style="position:absolute;margin-left:25.15pt;margin-top:0.05pt;width:445.7pt;height:157.1pt;mso-wrap-style:square;v-text-anchor:top;mso-position-horizontal:center">
+                <v:fill o:detectmouseclick="t" type="solid" color2="black"/>
+                <v:stroke color="#3465a4" joinstyle="round" endcap="flat"/>
+                <v:textbox>
                   <w:txbxContent>
                     <w:p>
                       <w:pPr>
-                        <w:pStyle w:val="Style18"/>
+                        <w:pStyle w:val="user3"/>
                         <w:spacing w:before="0" w:after="200"/>
                         <w:jc w:val="center"/>
                         <w:rPr>
@@ -7466,13 +7451,7 @@
                         </w:rPr>
                       </w:pPr>
                       <w:r>
-                        <w:rPr>
-                          <w:rFonts w:ascii="Times New Roman" w:hAnsi="Times New Roman"/>
-                          <w:i w:val="false"/>
-                          <w:iCs w:val="false"/>
-                          <w:sz w:val="28"/>
-                          <w:szCs w:val="28"/>
-                        </w:rPr>
+                        <w:rPr/>
                         <w:drawing>
                           <wp:inline distT="0" distB="0" distL="0" distR="0">
                             <wp:extent cx="5661025" cy="1791335"/>
@@ -7511,6 +7490,15 @@
                             </a:graphic>
                           </wp:inline>
                         </w:drawing>
+                      </w:r>
+                      <w:r>
+                        <w:rPr>
+                          <w:rFonts w:ascii="Times New Roman" w:hAnsi="Times New Roman"/>
+                          <w:i w:val="false"/>
+                          <w:iCs w:val="false"/>
+                          <w:sz w:val="28"/>
+                          <w:szCs w:val="28"/>
+                        </w:rPr>
                         <w:t xml:space="preserve">Рисунок </w:t>
                       </w:r>
                       <w:r>
@@ -7689,9 +7677,10 @@
       </w:r>
     </w:p>
     <w:sectPr>
+      <w:footerReference w:type="default" r:id="rId10"/>
       <w:type w:val="nextPage"/>
       <w:pgSz w:w="11906" w:h="16838"/>
-      <w:pgMar w:left="1134" w:right="850" w:gutter="0" w:header="0" w:top="1134" w:footer="0" w:bottom="1134"/>
+      <w:pgMar w:left="1134" w:right="850" w:gutter="0" w:header="0" w:top="1134" w:footer="1134" w:bottom="1987"/>
       <w:pgNumType w:fmt="decimal"/>
       <w:formProt w:val="false"/>
       <w:textDirection w:val="lrTb"/>
@@ -7699,6 +7688,65 @@
     </w:sectPr>
   </w:body>
 </w:document>
+</file>
+
+<file path=word/footer1.xml><?xml version="1.0" encoding="utf-8"?>
+<w:ftr xmlns:o="urn:schemas-microsoft-com:office:office" xmlns:r="http://schemas.openxmlformats.org/officeDocument/2006/relationships" xmlns:v="urn:schemas-microsoft-com:vml" xmlns:w="http://schemas.openxmlformats.org/wordprocessingml/2006/main" xmlns:w10="urn:schemas-microsoft-com:office:word" xmlns:wp="http://schemas.openxmlformats.org/drawingml/2006/wordprocessingDrawing" xmlns:pic="http://schemas.openxmlformats.org/drawingml/2006/picture" xmlns:wps="http://schemas.microsoft.com/office/word/2010/wordprocessingShape" xmlns:wpg="http://schemas.microsoft.com/office/word/2010/wordprocessingGroup" xmlns:mc="http://schemas.openxmlformats.org/markup-compatibility/2006" xmlns:wp14="http://schemas.microsoft.com/office/word/2010/wordprocessingDrawing" xmlns:w14="http://schemas.microsoft.com/office/word/2010/wordml" xmlns:w15="http://schemas.microsoft.com/office/word/2012/wordml" mc:Ignorable="w14 wp14 w15">
+  <w:p>
+    <w:pPr>
+      <w:pStyle w:val="Footer"/>
+      <w:spacing w:before="0" w:after="200"/>
+      <w:jc w:val="center"/>
+      <w:rPr>
+        <w:rFonts w:ascii="Times New Roman" w:hAnsi="Times New Roman"/>
+        <w:sz w:val="28"/>
+        <w:szCs w:val="28"/>
+      </w:rPr>
+    </w:pPr>
+    <w:bookmarkStart w:id="0" w:name="PageNumWizard_FOOTER_Базовый1"/>
+    <w:bookmarkEnd w:id="0"/>
+    <w:r>
+      <w:rPr>
+        <w:rFonts w:ascii="Times New Roman" w:hAnsi="Times New Roman"/>
+        <w:sz w:val="28"/>
+        <w:szCs w:val="28"/>
+      </w:rPr>
+      <w:fldChar w:fldCharType="begin"/>
+    </w:r>
+    <w:r>
+      <w:rPr>
+        <w:rFonts w:ascii="Times New Roman" w:hAnsi="Times New Roman"/>
+        <w:sz w:val="28"/>
+        <w:szCs w:val="28"/>
+      </w:rPr>
+      <w:instrText xml:space="preserve"> PAGE </w:instrText>
+    </w:r>
+    <w:r>
+      <w:rPr>
+        <w:rFonts w:ascii="Times New Roman" w:hAnsi="Times New Roman"/>
+        <w:sz w:val="28"/>
+        <w:szCs w:val="28"/>
+      </w:rPr>
+      <w:fldChar w:fldCharType="separate"/>
+    </w:r>
+    <w:r>
+      <w:rPr>
+        <w:rFonts w:ascii="Times New Roman" w:hAnsi="Times New Roman"/>
+        <w:sz w:val="28"/>
+        <w:szCs w:val="28"/>
+      </w:rPr>
+      <w:t>13</w:t>
+    </w:r>
+    <w:r>
+      <w:rPr>
+        <w:rFonts w:ascii="Times New Roman" w:hAnsi="Times New Roman"/>
+        <w:sz w:val="28"/>
+        <w:szCs w:val="28"/>
+      </w:rPr>
+      <w:fldChar w:fldCharType="end"/>
+    </w:r>
+  </w:p>
+</w:ftr>
 </file>
 
 <file path=word/styles.xml><?xml version="1.0" encoding="utf-8"?>
@@ -8104,7 +8152,7 @@
       <w:suppressAutoHyphens w:val="true"/>
       <w:bidi w:val="0"/>
       <w:spacing w:lineRule="auto" w:line="276" w:before="0" w:after="200"/>
-      <w:jc w:val="left"/>
+      <w:jc w:val="start"/>
     </w:pPr>
     <w:rPr>
       <w:rFonts w:ascii="Calibri" w:hAnsi="Calibri" w:eastAsia="Calibri" w:cs="" w:asciiTheme="minorHAnsi" w:cstheme="minorBidi" w:eastAsiaTheme="minorHAnsi" w:hAnsiTheme="minorHAnsi"/>
@@ -8136,14 +8184,14 @@
       <w:szCs w:val="16"/>
     </w:rPr>
   </w:style>
-  <w:style w:type="character" w:styleId="Style15">
-    <w:name w:val="Исходный текст"/>
+  <w:style w:type="character" w:styleId="user">
+    <w:name w:val="Исходный текст (user)"/>
     <w:qFormat/>
     <w:rPr>
       <w:rFonts w:ascii="Liberation Mono" w:hAnsi="Liberation Mono" w:eastAsia="Liberation Mono" w:cs="Liberation Mono"/>
     </w:rPr>
   </w:style>
-  <w:style w:type="paragraph" w:styleId="Style16">
+  <w:style w:type="paragraph" w:styleId="Style15">
     <w:name w:val="Заголовок"/>
     <w:basedOn w:val="Normal"/>
     <w:next w:val="BodyText"/>
@@ -8195,8 +8243,34 @@
       <w:szCs w:val="18"/>
     </w:rPr>
   </w:style>
-  <w:style w:type="paragraph" w:styleId="Style17">
+  <w:style w:type="paragraph" w:styleId="Style16">
     <w:name w:val="Указатель"/>
+    <w:basedOn w:val="Normal"/>
+    <w:qFormat/>
+    <w:pPr>
+      <w:suppressLineNumbers/>
+    </w:pPr>
+    <w:rPr>
+      <w:rFonts w:cs="Noto Sans Devanagari"/>
+    </w:rPr>
+  </w:style>
+  <w:style w:type="paragraph" w:styleId="user1">
+    <w:name w:val="Заголовок (user)"/>
+    <w:basedOn w:val="Normal"/>
+    <w:next w:val="BodyText"/>
+    <w:qFormat/>
+    <w:pPr>
+      <w:keepNext w:val="true"/>
+      <w:spacing w:before="240" w:after="120"/>
+    </w:pPr>
+    <w:rPr>
+      <w:rFonts w:ascii="Liberation Sans" w:hAnsi="Liberation Sans" w:eastAsia="Noto Sans" w:cs="Noto Sans Devanagari"/>
+      <w:sz w:val="28"/>
+      <w:szCs w:val="28"/>
+    </w:rPr>
+  </w:style>
+  <w:style w:type="paragraph" w:styleId="user2">
+    <w:name w:val="Указатель (user)"/>
     <w:basedOn w:val="Normal"/>
     <w:qFormat/>
     <w:pPr>
@@ -8251,8 +8325,8 @@
       <w:rFonts w:cs="Arial"/>
     </w:rPr>
   </w:style>
-  <w:style w:type="paragraph" w:styleId="user" w:customStyle="1">
-    <w:name w:val="Содержимое таблицы (user)"/>
+  <w:style w:type="paragraph" w:styleId="Style17" w:customStyle="1">
+    <w:name w:val="Содержимое таблицы"/>
     <w:basedOn w:val="Normal"/>
     <w:qFormat/>
     <w:rsid w:val="000d55fb"/>
@@ -8261,9 +8335,9 @@
     </w:pPr>
     <w:rPr/>
   </w:style>
-  <w:style w:type="paragraph" w:styleId="user1" w:customStyle="1">
-    <w:name w:val="Заголовок таблицы (user)"/>
-    <w:basedOn w:val="user"/>
+  <w:style w:type="paragraph" w:styleId="Style18" w:customStyle="1">
+    <w:name w:val="Заголовок таблицы"/>
+    <w:basedOn w:val="Style17"/>
     <w:qFormat/>
     <w:rsid w:val="000d55fb"/>
     <w:pPr>
@@ -8292,22 +8366,51 @@
       <w:szCs w:val="16"/>
     </w:rPr>
   </w:style>
-  <w:style w:type="paragraph" w:styleId="Style18">
-    <w:name w:val="Рисунок"/>
+  <w:style w:type="paragraph" w:styleId="user3">
+    <w:name w:val="Рисунок (user)"/>
+    <w:basedOn w:val="Caption"/>
+    <w:qFormat/>
+    <w:pPr/>
+    <w:rPr/>
+  </w:style>
+  <w:style w:type="paragraph" w:styleId="user4">
+    <w:name w:val="Текст (user)"/>
     <w:basedOn w:val="Caption"/>
     <w:qFormat/>
     <w:pPr/>
     <w:rPr/>
   </w:style>
   <w:style w:type="paragraph" w:styleId="Style19">
-    <w:name w:val="Текст"/>
-    <w:basedOn w:val="Caption"/>
+    <w:name w:val="Содержимое врезки"/>
+    <w:basedOn w:val="Normal"/>
     <w:qFormat/>
     <w:pPr/>
     <w:rPr/>
   </w:style>
-  <w:style w:type="numbering" w:styleId="Style20" w:default="1">
-    <w:name w:val="Без списка"/>
+  <w:style w:type="paragraph" w:styleId="Style20">
+    <w:name w:val="Колонтитулы"/>
+    <w:basedOn w:val="Normal"/>
+    <w:qFormat/>
+    <w:pPr>
+      <w:suppressLineNumbers/>
+      <w:tabs>
+        <w:tab w:val="clear" w:pos="720"/>
+        <w:tab w:val="center" w:pos="4961" w:leader="none"/>
+        <w:tab w:val="right" w:pos="9922" w:leader="none"/>
+      </w:tabs>
+    </w:pPr>
+    <w:rPr/>
+  </w:style>
+  <w:style w:type="paragraph" w:styleId="Footer">
+    <w:name w:val="footer"/>
+    <w:basedOn w:val="Style20"/>
+    <w:pPr>
+      <w:suppressLineNumbers/>
+    </w:pPr>
+    <w:rPr/>
+  </w:style>
+  <w:style w:type="numbering" w:styleId="user5" w:default="1">
+    <w:name w:val="Без списка (user)"/>
     <w:uiPriority w:val="99"/>
     <w:semiHidden/>
     <w:unhideWhenUsed/>

</xml_diff>

<commit_message>
feat: pitpo lab5 report diagrams and signed title
</commit_message>
<xml_diff>
--- a/Проектирование и тестирование программного обеспечения/отчёт.docx
+++ b/Проектирование и тестирование программного обеспечения/отчёт.docx
@@ -13,6 +13,54 @@
           <w:szCs w:val="24"/>
         </w:rPr>
       </w:pPr>
+      <w:r>
+        <w:drawing>
+          <wp:anchor distT="0" distB="0" distL="0" distR="0" simplePos="0" relativeHeight="14" behindDoc="0" locked="0" layoutInCell="1" allowOverlap="1">
+            <wp:simplePos x="0" y="0"/>
+            <wp:positionH relativeFrom="column">
+              <wp:posOffset>-714375</wp:posOffset>
+            </wp:positionH>
+            <wp:positionV relativeFrom="paragraph">
+              <wp:posOffset>-720090</wp:posOffset>
+            </wp:positionV>
+            <wp:extent cx="7477760" cy="10692130"/>
+            <wp:effectExtent l="0" t="0" r="0" b="0"/>
+            <wp:wrapNone/>
+            <wp:docPr id="1" name="Изображение5"/>
+            <wp:cNvGraphicFramePr>
+              <a:graphicFrameLocks xmlns:a="http://schemas.openxmlformats.org/drawingml/2006/main" noChangeAspect="1"/>
+            </wp:cNvGraphicFramePr>
+            <a:graphic xmlns:a="http://schemas.openxmlformats.org/drawingml/2006/main">
+              <a:graphicData uri="http://schemas.openxmlformats.org/drawingml/2006/picture">
+                <pic:pic xmlns:pic="http://schemas.openxmlformats.org/drawingml/2006/picture">
+                  <pic:nvPicPr>
+                    <pic:cNvPr id="1" name="Изображение5"/>
+                    <pic:cNvPicPr>
+                      <a:picLocks noChangeAspect="1" noChangeArrowheads="1"/>
+                    </pic:cNvPicPr>
+                  </pic:nvPicPr>
+                  <pic:blipFill>
+                    <a:blip r:embed="rId2"/>
+                    <a:stretch>
+                      <a:fillRect/>
+                    </a:stretch>
+                  </pic:blipFill>
+                  <pic:spPr bwMode="auto">
+                    <a:xfrm>
+                      <a:off x="0" y="0"/>
+                      <a:ext cx="7477760" cy="10692130"/>
+                    </a:xfrm>
+                    <a:prstGeom prst="rect">
+                      <a:avLst/>
+                    </a:prstGeom>
+                    <a:noFill/>
+                  </pic:spPr>
+                </pic:pic>
+              </a:graphicData>
+            </a:graphic>
+          </wp:anchor>
+        </w:drawing>
+      </w:r>
       <w:r>
         <w:rPr>
           <w:rFonts w:cs="Times New Roman" w:ascii="Times New Roman" w:hAnsi="Times New Roman"/>
@@ -449,14 +497,14 @@
         <w:tblLook w:noHBand="0" w:noVBand="1" w:firstColumn="1" w:lastRow="0" w:lastColumn="0" w:firstRow="1" w:val="04a0"/>
       </w:tblPr>
       <w:tblGrid>
-        <w:gridCol w:w="2035"/>
-        <w:gridCol w:w="3065"/>
+        <w:gridCol w:w="2034"/>
+        <w:gridCol w:w="3066"/>
       </w:tblGrid>
       <w:tr>
         <w:trPr/>
         <w:tc>
           <w:tcPr>
-            <w:tcW w:w="2035" w:type="dxa"/>
+            <w:tcW w:w="2034" w:type="dxa"/>
             <w:tcBorders>
               <w:top w:val="nil"/>
               <w:start w:val="nil"/>
@@ -496,7 +544,7 @@
         </w:tc>
         <w:tc>
           <w:tcPr>
-            <w:tcW w:w="3065" w:type="dxa"/>
+            <w:tcW w:w="3066" w:type="dxa"/>
             <w:tcBorders>
               <w:top w:val="nil"/>
               <w:start w:val="nil"/>
@@ -539,7 +587,7 @@
         <w:trPr/>
         <w:tc>
           <w:tcPr>
-            <w:tcW w:w="2035" w:type="dxa"/>
+            <w:tcW w:w="2034" w:type="dxa"/>
             <w:tcBorders>
               <w:top w:val="nil"/>
               <w:start w:val="nil"/>
@@ -576,7 +624,7 @@
         </w:tc>
         <w:tc>
           <w:tcPr>
-            <w:tcW w:w="3065" w:type="dxa"/>
+            <w:tcW w:w="3066" w:type="dxa"/>
             <w:tcBorders>
               <w:top w:val="nil"/>
               <w:start w:val="nil"/>
@@ -621,7 +669,7 @@
         </w:trPr>
         <w:tc>
           <w:tcPr>
-            <w:tcW w:w="2035" w:type="dxa"/>
+            <w:tcW w:w="2034" w:type="dxa"/>
             <w:tcBorders>
               <w:top w:val="nil"/>
               <w:start w:val="nil"/>
@@ -661,7 +709,7 @@
         </w:tc>
         <w:tc>
           <w:tcPr>
-            <w:tcW w:w="3065" w:type="dxa"/>
+            <w:tcW w:w="3066" w:type="dxa"/>
             <w:tcBorders>
               <w:top w:val="nil"/>
               <w:start w:val="nil"/>
@@ -810,6 +858,7 @@
           <w:pgNumType w:fmt="decimal"/>
           <w:formProt w:val="false"/>
           <w:textDirection w:val="lrTb"/>
+          <w:docGrid w:type="default" w:linePitch="100" w:charSpace="0"/>
         </w:sectPr>
       </w:pPr>
       <w:r>
@@ -1075,18 +1124,26 @@
         <mc:AlternateContent>
           <mc:Choice Requires="wps">
             <w:drawing>
-              <wp:anchor distT="0" distB="0" distL="0" distR="0" simplePos="0" relativeHeight="2" behindDoc="0" locked="0" layoutInCell="0" allowOverlap="1">
+              <wp:anchor distT="0" distB="0" distL="0" distR="635" simplePos="0" relativeHeight="2" behindDoc="0" locked="0" layoutInCell="0" allowOverlap="1">
                 <wp:simplePos x="0" y="0"/>
                 <wp:positionH relativeFrom="column">
-                  <wp:posOffset>1572260</wp:posOffset>
+                  <wp:posOffset>1860550</wp:posOffset>
                 </wp:positionH>
                 <wp:positionV relativeFrom="paragraph">
                   <wp:posOffset>41275</wp:posOffset>
                 </wp:positionV>
-                <wp:extent cx="3155315" cy="7833360"/>
+                <wp:extent cx="2578100" cy="8014335"/>
                 <wp:effectExtent l="0" t="0" r="0" b="0"/>
-                <wp:wrapTopAndBottom/>
-                <wp:docPr id="1" name="Врезка1"/>
+                <wp:wrapTight wrapText="bothSides">
+                  <wp:wrapPolygon edited="0">
+                    <wp:start x="0" y="21599"/>
+                    <wp:lineTo x="0" y="-1"/>
+                    <wp:lineTo x="21600" y="-1"/>
+                    <wp:lineTo x="21600" y="21599"/>
+                    <wp:lineTo x="0" y="21599"/>
+                  </wp:wrapPolygon>
+                </wp:wrapTight>
+                <wp:docPr id="2" name="Врезка1"/>
                 <a:graphic xmlns:a="http://schemas.openxmlformats.org/drawingml/2006/main">
                   <a:graphicData uri="http://schemas.microsoft.com/office/word/2010/wordprocessingShape">
                     <wps:wsp>
@@ -1094,7 +1151,7 @@
                       <wps:spPr>
                         <a:xfrm>
                           <a:off x="0" y="0"/>
-                          <a:ext cx="3155400" cy="7833240"/>
+                          <a:ext cx="2577960" cy="8014320"/>
                         </a:xfrm>
                         <a:prstGeom prst="rect">
                           <a:avLst/>
@@ -1116,7 +1173,7 @@
                         <w:txbxContent>
                           <w:p>
                             <w:pPr>
-                              <w:pStyle w:val="user3"/>
+                              <w:pStyle w:val="Style18"/>
                               <w:spacing w:before="0" w:after="200"/>
                               <w:jc w:val="center"/>
                               <w:rPr>
@@ -1132,9 +1189,9 @@
                               <w:rPr/>
                               <w:drawing>
                                 <wp:inline distT="0" distB="0" distL="0" distR="0">
-                                  <wp:extent cx="3069590" cy="7423785"/>
+                                  <wp:extent cx="2054225" cy="7423785"/>
                                   <wp:effectExtent l="0" t="0" r="0" b="0"/>
-                                  <wp:docPr id="2" name="Изображение1"/>
+                                  <wp:docPr id="3" name="Изображение1"/>
                                   <wp:cNvGraphicFramePr>
                                     <a:graphicFrameLocks xmlns:a="http://schemas.openxmlformats.org/drawingml/2006/main" noChangeAspect="1"/>
                                   </wp:cNvGraphicFramePr>
@@ -1142,13 +1199,13 @@
                                     <a:graphicData uri="http://schemas.openxmlformats.org/drawingml/2006/picture">
                                       <pic:pic xmlns:pic="http://schemas.openxmlformats.org/drawingml/2006/picture">
                                         <pic:nvPicPr>
-                                          <pic:cNvPr id="2" name="Изображение1"/>
+                                          <pic:cNvPr id="3" name="Изображение1"/>
                                           <pic:cNvPicPr>
                                             <a:picLocks noChangeAspect="1" noChangeArrowheads="1"/>
                                           </pic:cNvPicPr>
                                         </pic:nvPicPr>
                                         <pic:blipFill>
-                                          <a:blip r:embed="rId2"/>
+                                          <a:blip r:embed="rId3"/>
                                           <a:stretch>
                                             <a:fillRect/>
                                           </a:stretch>
@@ -1156,7 +1213,7 @@
                                         <pic:spPr bwMode="auto">
                                           <a:xfrm>
                                             <a:off x="0" y="0"/>
-                                            <a:ext cx="3069590" cy="7423785"/>
+                                            <a:ext cx="2054225" cy="7423785"/>
                                           </a:xfrm>
                                           <a:prstGeom prst="rect">
                                             <a:avLst/>
@@ -1169,6 +1226,21 @@
                                 </wp:inline>
                               </w:drawing>
                             </w:r>
+                          </w:p>
+                          <w:p>
+                            <w:pPr>
+                              <w:pStyle w:val="Style18"/>
+                              <w:spacing w:before="0" w:after="200"/>
+                              <w:jc w:val="center"/>
+                              <w:rPr>
+                                <w:rFonts w:ascii="Times New Roman" w:hAnsi="Times New Roman"/>
+                                <w:i w:val="false"/>
+                                <w:iCs w:val="false"/>
+                                <w:color w:val="000000"/>
+                                <w:sz w:val="28"/>
+                                <w:szCs w:val="28"/>
+                              </w:rPr>
+                            </w:pPr>
                             <w:r>
                               <w:rPr>
                                 <w:rFonts w:ascii="Times New Roman" w:hAnsi="Times New Roman"/>
@@ -1260,14 +1332,14 @@
           </mc:Choice>
           <mc:Fallback>
             <w:pict>
-              <v:rect id="shape_0" fillcolor="white" stroked="f" o:allowincell="f" style="position:absolute;margin-left:123.8pt;margin-top:3.25pt;width:248.4pt;height:616.75pt;mso-wrap-style:square;v-text-anchor:top">
+              <v:rect id="shape_0" fillcolor="white" stroked="f" o:allowincell="f" style="position:absolute;margin-left:146.5pt;margin-top:3.25pt;width:202.95pt;height:631pt;mso-wrap-style:square;v-text-anchor:top">
                 <v:fill o:detectmouseclick="t" type="solid" color2="black"/>
                 <v:stroke color="#3465a4" joinstyle="round" endcap="flat"/>
                 <v:textbox>
                   <w:txbxContent>
                     <w:p>
                       <w:pPr>
-                        <w:pStyle w:val="user3"/>
+                        <w:pStyle w:val="Style18"/>
                         <w:spacing w:before="0" w:after="200"/>
                         <w:jc w:val="center"/>
                         <w:rPr>
@@ -1283,9 +1355,9 @@
                         <w:rPr/>
                         <w:drawing>
                           <wp:inline distT="0" distB="0" distL="0" distR="0">
-                            <wp:extent cx="3069590" cy="7423785"/>
+                            <wp:extent cx="2054225" cy="7423785"/>
                             <wp:effectExtent l="0" t="0" r="0" b="0"/>
-                            <wp:docPr id="3" name="Изображение1"/>
+                            <wp:docPr id="4" name="Изображение1"/>
                             <wp:cNvGraphicFramePr>
                               <a:graphicFrameLocks xmlns:a="http://schemas.openxmlformats.org/drawingml/2006/main" noChangeAspect="1"/>
                             </wp:cNvGraphicFramePr>
@@ -1293,13 +1365,13 @@
                               <a:graphicData uri="http://schemas.openxmlformats.org/drawingml/2006/picture">
                                 <pic:pic xmlns:pic="http://schemas.openxmlformats.org/drawingml/2006/picture">
                                   <pic:nvPicPr>
-                                    <pic:cNvPr id="3" name="Изображение1"/>
+                                    <pic:cNvPr id="4" name="Изображение1"/>
                                     <pic:cNvPicPr>
                                       <a:picLocks noChangeAspect="1" noChangeArrowheads="1"/>
                                     </pic:cNvPicPr>
                                   </pic:nvPicPr>
                                   <pic:blipFill>
-                                    <a:blip r:embed="rId3"/>
+                                    <a:blip r:embed="rId4"/>
                                     <a:stretch>
                                       <a:fillRect/>
                                     </a:stretch>
@@ -1307,7 +1379,7 @@
                                   <pic:spPr bwMode="auto">
                                     <a:xfrm>
                                       <a:off x="0" y="0"/>
-                                      <a:ext cx="3069590" cy="7423785"/>
+                                      <a:ext cx="2054225" cy="7423785"/>
                                     </a:xfrm>
                                     <a:prstGeom prst="rect">
                                       <a:avLst/>
@@ -1320,6 +1392,21 @@
                           </wp:inline>
                         </w:drawing>
                       </w:r>
+                    </w:p>
+                    <w:p>
+                      <w:pPr>
+                        <w:pStyle w:val="Style18"/>
+                        <w:spacing w:before="0" w:after="200"/>
+                        <w:jc w:val="center"/>
+                        <w:rPr>
+                          <w:rFonts w:ascii="Times New Roman" w:hAnsi="Times New Roman"/>
+                          <w:i w:val="false"/>
+                          <w:iCs w:val="false"/>
+                          <w:color w:val="000000"/>
+                          <w:sz w:val="28"/>
+                          <w:szCs w:val="28"/>
+                        </w:rPr>
+                      </w:pPr>
                       <w:r>
                         <w:rPr>
                           <w:rFonts w:ascii="Times New Roman" w:hAnsi="Times New Roman"/>
@@ -1400,7 +1487,7 @@
                     </w:p>
                   </w:txbxContent>
                 </v:textbox>
-                <w10:wrap type="topAndBottom"/>
+                <w10:wrap type="square"/>
               </v:rect>
             </w:pict>
           </mc:Fallback>
@@ -1413,6 +1500,7 @@
     <w:p>
       <w:pPr>
         <w:pStyle w:val="Normal"/>
+        <w:spacing w:before="0" w:after="200"/>
         <w:rPr/>
       </w:pPr>
       <w:r>
@@ -3649,7 +3737,7 @@
                 <wp:extent cx="5634355" cy="2320290"/>
                 <wp:effectExtent l="0" t="0" r="0" b="0"/>
                 <wp:wrapTopAndBottom/>
-                <wp:docPr id="4" name="Врезка2"/>
+                <wp:docPr id="5" name="Врезка2"/>
                 <a:graphic xmlns:a="http://schemas.openxmlformats.org/drawingml/2006/main">
                   <a:graphicData uri="http://schemas.microsoft.com/office/word/2010/wordprocessingShape">
                     <wps:wsp>
@@ -3679,7 +3767,7 @@
                         <w:txbxContent>
                           <w:p>
                             <w:pPr>
-                              <w:pStyle w:val="user3"/>
+                              <w:pStyle w:val="Style18"/>
                               <w:spacing w:before="0" w:after="200"/>
                               <w:jc w:val="center"/>
                               <w:rPr>
@@ -3697,7 +3785,7 @@
                                 <wp:inline distT="0" distB="0" distL="0" distR="0">
                                   <wp:extent cx="5634355" cy="2115820"/>
                                   <wp:effectExtent l="0" t="0" r="0" b="0"/>
-                                  <wp:docPr id="5" name="Изображение2"/>
+                                  <wp:docPr id="6" name="Изображение2"/>
                                   <wp:cNvGraphicFramePr>
                                     <a:graphicFrameLocks xmlns:a="http://schemas.openxmlformats.org/drawingml/2006/main" noChangeAspect="1"/>
                                   </wp:cNvGraphicFramePr>
@@ -3705,13 +3793,13 @@
                                     <a:graphicData uri="http://schemas.openxmlformats.org/drawingml/2006/picture">
                                       <pic:pic xmlns:pic="http://schemas.openxmlformats.org/drawingml/2006/picture">
                                         <pic:nvPicPr>
-                                          <pic:cNvPr id="5" name="Изображение2"/>
+                                          <pic:cNvPr id="6" name="Изображение2"/>
                                           <pic:cNvPicPr>
                                             <a:picLocks noChangeAspect="1" noChangeArrowheads="1"/>
                                           </pic:cNvPicPr>
                                         </pic:nvPicPr>
                                         <pic:blipFill>
-                                          <a:blip r:embed="rId4"/>
+                                          <a:blip r:embed="rId5"/>
                                           <a:stretch>
                                             <a:fillRect/>
                                           </a:stretch>
@@ -3830,7 +3918,7 @@
                   <w:txbxContent>
                     <w:p>
                       <w:pPr>
-                        <w:pStyle w:val="user3"/>
+                        <w:pStyle w:val="Style18"/>
                         <w:spacing w:before="0" w:after="200"/>
                         <w:jc w:val="center"/>
                         <w:rPr>
@@ -3848,7 +3936,7 @@
                           <wp:inline distT="0" distB="0" distL="0" distR="0">
                             <wp:extent cx="5634355" cy="2115820"/>
                             <wp:effectExtent l="0" t="0" r="0" b="0"/>
-                            <wp:docPr id="6" name="Изображение2"/>
+                            <wp:docPr id="7" name="Изображение2"/>
                             <wp:cNvGraphicFramePr>
                               <a:graphicFrameLocks xmlns:a="http://schemas.openxmlformats.org/drawingml/2006/main" noChangeAspect="1"/>
                             </wp:cNvGraphicFramePr>
@@ -3856,13 +3944,13 @@
                               <a:graphicData uri="http://schemas.openxmlformats.org/drawingml/2006/picture">
                                 <pic:pic xmlns:pic="http://schemas.openxmlformats.org/drawingml/2006/picture">
                                   <pic:nvPicPr>
-                                    <pic:cNvPr id="6" name="Изображение2"/>
+                                    <pic:cNvPr id="7" name="Изображение2"/>
                                     <pic:cNvPicPr>
                                       <a:picLocks noChangeAspect="1" noChangeArrowheads="1"/>
                                     </pic:cNvPicPr>
                                   </pic:nvPicPr>
                                   <pic:blipFill>
-                                    <a:blip r:embed="rId5"/>
+                                    <a:blip r:embed="rId6"/>
                                     <a:stretch>
                                       <a:fillRect/>
                                     </a:stretch>
@@ -4310,10 +4398,10 @@
                 <wp:positionV relativeFrom="paragraph">
                   <wp:posOffset>32385</wp:posOffset>
                 </wp:positionV>
-                <wp:extent cx="4203700" cy="7429500"/>
+                <wp:extent cx="4203700" cy="7677150"/>
                 <wp:effectExtent l="0" t="0" r="0" b="0"/>
                 <wp:wrapTopAndBottom/>
-                <wp:docPr id="7" name="Врезка3"/>
+                <wp:docPr id="8" name="Врезка3"/>
                 <a:graphic xmlns:a="http://schemas.openxmlformats.org/drawingml/2006/main">
                   <a:graphicData uri="http://schemas.microsoft.com/office/word/2010/wordprocessingShape">
                     <wps:wsp>
@@ -4321,7 +4409,7 @@
                       <wps:spPr>
                         <a:xfrm>
                           <a:off x="0" y="0"/>
-                          <a:ext cx="4203720" cy="7429680"/>
+                          <a:ext cx="4203720" cy="7677000"/>
                         </a:xfrm>
                         <a:prstGeom prst="rect">
                           <a:avLst/>
@@ -4343,7 +4431,7 @@
                         <w:txbxContent>
                           <w:p>
                             <w:pPr>
-                              <w:pStyle w:val="user3"/>
+                              <w:pStyle w:val="Style18"/>
                               <w:spacing w:before="0" w:after="200"/>
                               <w:jc w:val="center"/>
                               <w:rPr>
@@ -4359,9 +4447,9 @@
                               <w:rPr/>
                               <w:drawing>
                                 <wp:inline distT="0" distB="0" distL="0" distR="0">
-                                  <wp:extent cx="4203700" cy="7225030"/>
+                                  <wp:extent cx="3703320" cy="7225030"/>
                                   <wp:effectExtent l="0" t="0" r="0" b="0"/>
-                                  <wp:docPr id="8" name="Изображение3"/>
+                                  <wp:docPr id="9" name="Изображение3"/>
                                   <wp:cNvGraphicFramePr>
                                     <a:graphicFrameLocks xmlns:a="http://schemas.openxmlformats.org/drawingml/2006/main" noChangeAspect="1"/>
                                   </wp:cNvGraphicFramePr>
@@ -4369,13 +4457,13 @@
                                     <a:graphicData uri="http://schemas.openxmlformats.org/drawingml/2006/picture">
                                       <pic:pic xmlns:pic="http://schemas.openxmlformats.org/drawingml/2006/picture">
                                         <pic:nvPicPr>
-                                          <pic:cNvPr id="8" name="Изображение3"/>
+                                          <pic:cNvPr id="9" name="Изображение3"/>
                                           <pic:cNvPicPr>
                                             <a:picLocks noChangeAspect="1" noChangeArrowheads="1"/>
                                           </pic:cNvPicPr>
                                         </pic:nvPicPr>
                                         <pic:blipFill>
-                                          <a:blip r:embed="rId6"/>
+                                          <a:blip r:embed="rId7"/>
                                           <a:stretch>
                                             <a:fillRect/>
                                           </a:stretch>
@@ -4383,7 +4471,7 @@
                                         <pic:spPr bwMode="auto">
                                           <a:xfrm>
                                             <a:off x="0" y="0"/>
-                                            <a:ext cx="4203700" cy="7225030"/>
+                                            <a:ext cx="3703320" cy="7225030"/>
                                           </a:xfrm>
                                           <a:prstGeom prst="rect">
                                             <a:avLst/>
@@ -4396,6 +4484,21 @@
                                 </wp:inline>
                               </w:drawing>
                             </w:r>
+                          </w:p>
+                          <w:p>
+                            <w:pPr>
+                              <w:pStyle w:val="Style18"/>
+                              <w:spacing w:before="0" w:after="200"/>
+                              <w:jc w:val="center"/>
+                              <w:rPr>
+                                <w:rFonts w:ascii="Times New Roman" w:hAnsi="Times New Roman"/>
+                                <w:i w:val="false"/>
+                                <w:iCs w:val="false"/>
+                                <w:color w:val="000000"/>
+                                <w:sz w:val="28"/>
+                                <w:szCs w:val="28"/>
+                              </w:rPr>
+                            </w:pPr>
                             <w:r>
                               <w:rPr>
                                 <w:rFonts w:ascii="Times New Roman" w:hAnsi="Times New Roman"/>
@@ -4487,14 +4590,14 @@
           </mc:Choice>
           <mc:Fallback>
             <w:pict>
-              <v:rect id="shape_0" fillcolor="white" stroked="f" o:allowincell="f" style="position:absolute;margin-left:82.55pt;margin-top:2.55pt;width:330.95pt;height:584.95pt;mso-wrap-style:square;v-text-anchor:top">
+              <v:rect id="shape_0" fillcolor="white" stroked="f" o:allowincell="f" style="position:absolute;margin-left:82.55pt;margin-top:2.55pt;width:330.95pt;height:604.45pt;mso-wrap-style:square;v-text-anchor:top">
                 <v:fill o:detectmouseclick="t" type="solid" color2="black"/>
                 <v:stroke color="#3465a4" joinstyle="round" endcap="flat"/>
                 <v:textbox>
                   <w:txbxContent>
                     <w:p>
                       <w:pPr>
-                        <w:pStyle w:val="user3"/>
+                        <w:pStyle w:val="Style18"/>
                         <w:spacing w:before="0" w:after="200"/>
                         <w:jc w:val="center"/>
                         <w:rPr>
@@ -4510,9 +4613,9 @@
                         <w:rPr/>
                         <w:drawing>
                           <wp:inline distT="0" distB="0" distL="0" distR="0">
-                            <wp:extent cx="4203700" cy="7225030"/>
+                            <wp:extent cx="3703320" cy="7225030"/>
                             <wp:effectExtent l="0" t="0" r="0" b="0"/>
-                            <wp:docPr id="9" name="Изображение3"/>
+                            <wp:docPr id="10" name="Изображение3"/>
                             <wp:cNvGraphicFramePr>
                               <a:graphicFrameLocks xmlns:a="http://schemas.openxmlformats.org/drawingml/2006/main" noChangeAspect="1"/>
                             </wp:cNvGraphicFramePr>
@@ -4520,13 +4623,13 @@
                               <a:graphicData uri="http://schemas.openxmlformats.org/drawingml/2006/picture">
                                 <pic:pic xmlns:pic="http://schemas.openxmlformats.org/drawingml/2006/picture">
                                   <pic:nvPicPr>
-                                    <pic:cNvPr id="9" name="Изображение3"/>
+                                    <pic:cNvPr id="10" name="Изображение3"/>
                                     <pic:cNvPicPr>
                                       <a:picLocks noChangeAspect="1" noChangeArrowheads="1"/>
                                     </pic:cNvPicPr>
                                   </pic:nvPicPr>
                                   <pic:blipFill>
-                                    <a:blip r:embed="rId7"/>
+                                    <a:blip r:embed="rId8"/>
                                     <a:stretch>
                                       <a:fillRect/>
                                     </a:stretch>
@@ -4534,7 +4637,7 @@
                                   <pic:spPr bwMode="auto">
                                     <a:xfrm>
                                       <a:off x="0" y="0"/>
-                                      <a:ext cx="4203700" cy="7225030"/>
+                                      <a:ext cx="3703320" cy="7225030"/>
                                     </a:xfrm>
                                     <a:prstGeom prst="rect">
                                       <a:avLst/>
@@ -4547,6 +4650,21 @@
                           </wp:inline>
                         </w:drawing>
                       </w:r>
+                    </w:p>
+                    <w:p>
+                      <w:pPr>
+                        <w:pStyle w:val="Style18"/>
+                        <w:spacing w:before="0" w:after="200"/>
+                        <w:jc w:val="center"/>
+                        <w:rPr>
+                          <w:rFonts w:ascii="Times New Roman" w:hAnsi="Times New Roman"/>
+                          <w:i w:val="false"/>
+                          <w:iCs w:val="false"/>
+                          <w:color w:val="000000"/>
+                          <w:sz w:val="28"/>
+                          <w:szCs w:val="28"/>
+                        </w:rPr>
+                      </w:pPr>
                       <w:r>
                         <w:rPr>
                           <w:rFonts w:ascii="Times New Roman" w:hAnsi="Times New Roman"/>
@@ -7266,7 +7384,7 @@
                 <wp:extent cx="5661025" cy="1995805"/>
                 <wp:effectExtent l="0" t="0" r="0" b="0"/>
                 <wp:wrapTopAndBottom/>
-                <wp:docPr id="10" name="Врезка4"/>
+                <wp:docPr id="11" name="Врезка4"/>
                 <a:graphic xmlns:a="http://schemas.openxmlformats.org/drawingml/2006/main">
                   <a:graphicData uri="http://schemas.microsoft.com/office/word/2010/wordprocessingShape">
                     <wps:wsp>
@@ -7296,7 +7414,7 @@
                         <w:txbxContent>
                           <w:p>
                             <w:pPr>
-                              <w:pStyle w:val="user3"/>
+                              <w:pStyle w:val="Style18"/>
                               <w:spacing w:before="0" w:after="200"/>
                               <w:jc w:val="center"/>
                               <w:rPr>
@@ -7313,7 +7431,7 @@
                                 <wp:inline distT="0" distB="0" distL="0" distR="0">
                                   <wp:extent cx="5661025" cy="1791335"/>
                                   <wp:effectExtent l="0" t="0" r="0" b="0"/>
-                                  <wp:docPr id="11" name="Изображение4"/>
+                                  <wp:docPr id="12" name="Изображение4"/>
                                   <wp:cNvGraphicFramePr>
                                     <a:graphicFrameLocks xmlns:a="http://schemas.openxmlformats.org/drawingml/2006/main" noChangeAspect="1"/>
                                   </wp:cNvGraphicFramePr>
@@ -7321,13 +7439,13 @@
                                     <a:graphicData uri="http://schemas.openxmlformats.org/drawingml/2006/picture">
                                       <pic:pic xmlns:pic="http://schemas.openxmlformats.org/drawingml/2006/picture">
                                         <pic:nvPicPr>
-                                          <pic:cNvPr id="11" name="Изображение4"/>
+                                          <pic:cNvPr id="12" name="Изображение4"/>
                                           <pic:cNvPicPr>
                                             <a:picLocks noChangeAspect="1" noChangeArrowheads="1"/>
                                           </pic:cNvPicPr>
                                         </pic:nvPicPr>
                                         <pic:blipFill>
-                                          <a:blip r:embed="rId8"/>
+                                          <a:blip r:embed="rId9"/>
                                           <a:stretch>
                                             <a:fillRect/>
                                           </a:stretch>
@@ -7439,7 +7557,7 @@
                   <w:txbxContent>
                     <w:p>
                       <w:pPr>
-                        <w:pStyle w:val="user3"/>
+                        <w:pStyle w:val="Style18"/>
                         <w:spacing w:before="0" w:after="200"/>
                         <w:jc w:val="center"/>
                         <w:rPr>
@@ -7456,7 +7574,7 @@
                           <wp:inline distT="0" distB="0" distL="0" distR="0">
                             <wp:extent cx="5661025" cy="1791335"/>
                             <wp:effectExtent l="0" t="0" r="0" b="0"/>
-                            <wp:docPr id="12" name="Изображение4"/>
+                            <wp:docPr id="13" name="Изображение4"/>
                             <wp:cNvGraphicFramePr>
                               <a:graphicFrameLocks xmlns:a="http://schemas.openxmlformats.org/drawingml/2006/main" noChangeAspect="1"/>
                             </wp:cNvGraphicFramePr>
@@ -7464,13 +7582,13 @@
                               <a:graphicData uri="http://schemas.openxmlformats.org/drawingml/2006/picture">
                                 <pic:pic xmlns:pic="http://schemas.openxmlformats.org/drawingml/2006/picture">
                                   <pic:nvPicPr>
-                                    <pic:cNvPr id="12" name="Изображение4"/>
+                                    <pic:cNvPr id="13" name="Изображение4"/>
                                     <pic:cNvPicPr>
                                       <a:picLocks noChangeAspect="1" noChangeArrowheads="1"/>
                                     </pic:cNvPicPr>
                                   </pic:nvPicPr>
                                   <pic:blipFill>
-                                    <a:blip r:embed="rId9"/>
+                                    <a:blip r:embed="rId10"/>
                                     <a:stretch>
                                       <a:fillRect/>
                                     </a:stretch>
@@ -7677,7 +7795,9 @@
       </w:r>
     </w:p>
     <w:sectPr>
-      <w:footerReference w:type="default" r:id="rId10"/>
+      <w:footerReference w:type="even" r:id="rId11"/>
+      <w:footerReference w:type="default" r:id="rId12"/>
+      <w:footerReference w:type="first" r:id="rId13"/>
       <w:type w:val="nextPage"/>
       <w:pgSz w:w="11906" w:h="16838"/>
       <w:pgMar w:left="1134" w:right="850" w:gutter="0" w:header="0" w:top="1134" w:footer="1134" w:bottom="1987"/>
@@ -7695,6 +7815,22 @@
   <w:p>
     <w:pPr>
       <w:pStyle w:val="Footer"/>
+      <w:suppressLineNumbers/>
+      <w:spacing w:before="0" w:after="200"/>
+      <w:rPr/>
+    </w:pPr>
+    <w:r>
+      <w:rPr/>
+    </w:r>
+  </w:p>
+</w:ftr>
+</file>
+
+<file path=word/footer2.xml><?xml version="1.0" encoding="utf-8"?>
+<w:ftr xmlns:o="urn:schemas-microsoft-com:office:office" xmlns:r="http://schemas.openxmlformats.org/officeDocument/2006/relationships" xmlns:v="urn:schemas-microsoft-com:vml" xmlns:w="http://schemas.openxmlformats.org/wordprocessingml/2006/main" xmlns:w10="urn:schemas-microsoft-com:office:word" xmlns:wp="http://schemas.openxmlformats.org/drawingml/2006/wordprocessingDrawing" xmlns:pic="http://schemas.openxmlformats.org/drawingml/2006/picture" xmlns:wps="http://schemas.microsoft.com/office/word/2010/wordprocessingShape" xmlns:wpg="http://schemas.microsoft.com/office/word/2010/wordprocessingGroup" xmlns:mc="http://schemas.openxmlformats.org/markup-compatibility/2006" xmlns:wp14="http://schemas.microsoft.com/office/word/2010/wordprocessingDrawing" xmlns:w14="http://schemas.microsoft.com/office/word/2010/wordml" xmlns:w15="http://schemas.microsoft.com/office/word/2012/wordml" mc:Ignorable="w14 wp14 w15">
+  <w:p>
+    <w:pPr>
+      <w:pStyle w:val="Footer"/>
       <w:spacing w:before="0" w:after="200"/>
       <w:jc w:val="center"/>
       <w:rPr>
@@ -7705,6 +7841,65 @@
     </w:pPr>
     <w:bookmarkStart w:id="0" w:name="PageNumWizard_FOOTER_Базовый1"/>
     <w:bookmarkEnd w:id="0"/>
+    <w:r>
+      <w:rPr>
+        <w:rFonts w:ascii="Times New Roman" w:hAnsi="Times New Roman"/>
+        <w:sz w:val="28"/>
+        <w:szCs w:val="28"/>
+      </w:rPr>
+      <w:fldChar w:fldCharType="begin"/>
+    </w:r>
+    <w:r>
+      <w:rPr>
+        <w:rFonts w:ascii="Times New Roman" w:hAnsi="Times New Roman"/>
+        <w:sz w:val="28"/>
+        <w:szCs w:val="28"/>
+      </w:rPr>
+      <w:instrText xml:space="preserve"> PAGE </w:instrText>
+    </w:r>
+    <w:r>
+      <w:rPr>
+        <w:rFonts w:ascii="Times New Roman" w:hAnsi="Times New Roman"/>
+        <w:sz w:val="28"/>
+        <w:szCs w:val="28"/>
+      </w:rPr>
+      <w:fldChar w:fldCharType="separate"/>
+    </w:r>
+    <w:r>
+      <w:rPr>
+        <w:rFonts w:ascii="Times New Roman" w:hAnsi="Times New Roman"/>
+        <w:sz w:val="28"/>
+        <w:szCs w:val="28"/>
+      </w:rPr>
+      <w:t>13</w:t>
+    </w:r>
+    <w:r>
+      <w:rPr>
+        <w:rFonts w:ascii="Times New Roman" w:hAnsi="Times New Roman"/>
+        <w:sz w:val="28"/>
+        <w:szCs w:val="28"/>
+      </w:rPr>
+      <w:fldChar w:fldCharType="end"/>
+    </w:r>
+  </w:p>
+</w:ftr>
+</file>
+
+<file path=word/footer3.xml><?xml version="1.0" encoding="utf-8"?>
+<w:ftr xmlns:o="urn:schemas-microsoft-com:office:office" xmlns:r="http://schemas.openxmlformats.org/officeDocument/2006/relationships" xmlns:v="urn:schemas-microsoft-com:vml" xmlns:w="http://schemas.openxmlformats.org/wordprocessingml/2006/main" xmlns:w10="urn:schemas-microsoft-com:office:word" xmlns:wp="http://schemas.openxmlformats.org/drawingml/2006/wordprocessingDrawing" xmlns:pic="http://schemas.openxmlformats.org/drawingml/2006/picture" xmlns:wps="http://schemas.microsoft.com/office/word/2010/wordprocessingShape" xmlns:wpg="http://schemas.microsoft.com/office/word/2010/wordprocessingGroup" xmlns:mc="http://schemas.openxmlformats.org/markup-compatibility/2006" xmlns:wp14="http://schemas.microsoft.com/office/word/2010/wordprocessingDrawing" xmlns:w14="http://schemas.microsoft.com/office/word/2010/wordml" xmlns:w15="http://schemas.microsoft.com/office/word/2012/wordml" mc:Ignorable="w14 wp14 w15">
+  <w:p>
+    <w:pPr>
+      <w:pStyle w:val="Footer"/>
+      <w:spacing w:before="0" w:after="200"/>
+      <w:jc w:val="center"/>
+      <w:rPr>
+        <w:rFonts w:ascii="Times New Roman" w:hAnsi="Times New Roman"/>
+        <w:sz w:val="28"/>
+        <w:szCs w:val="28"/>
+      </w:rPr>
+    </w:pPr>
+    <w:bookmarkStart w:id="1" w:name="PageNumWizard_FOOTER_Базовый1"/>
+    <w:bookmarkEnd w:id="1"/>
     <w:r>
       <w:rPr>
         <w:rFonts w:ascii="Times New Roman" w:hAnsi="Times New Roman"/>
@@ -8184,14 +8379,14 @@
       <w:szCs w:val="16"/>
     </w:rPr>
   </w:style>
-  <w:style w:type="character" w:styleId="user">
-    <w:name w:val="Исходный текст (user)"/>
+  <w:style w:type="character" w:styleId="Style15">
+    <w:name w:val="Исходный текст"/>
     <w:qFormat/>
     <w:rPr>
       <w:rFonts w:ascii="Liberation Mono" w:hAnsi="Liberation Mono" w:eastAsia="Liberation Mono" w:cs="Liberation Mono"/>
     </w:rPr>
   </w:style>
-  <w:style w:type="paragraph" w:styleId="Style15">
+  <w:style w:type="paragraph" w:styleId="Style16">
     <w:name w:val="Заголовок"/>
     <w:basedOn w:val="Normal"/>
     <w:next w:val="BodyText"/>
@@ -8243,7 +8438,7 @@
       <w:szCs w:val="18"/>
     </w:rPr>
   </w:style>
-  <w:style w:type="paragraph" w:styleId="Style16">
+  <w:style w:type="paragraph" w:styleId="Style17">
     <w:name w:val="Указатель"/>
     <w:basedOn w:val="Normal"/>
     <w:qFormat/>
@@ -8254,7 +8449,7 @@
       <w:rFonts w:cs="Noto Sans Devanagari"/>
     </w:rPr>
   </w:style>
-  <w:style w:type="paragraph" w:styleId="user1">
+  <w:style w:type="paragraph" w:styleId="user">
     <w:name w:val="Заголовок (user)"/>
     <w:basedOn w:val="Normal"/>
     <w:next w:val="BodyText"/>
@@ -8269,7 +8464,7 @@
       <w:szCs w:val="28"/>
     </w:rPr>
   </w:style>
-  <w:style w:type="paragraph" w:styleId="user2">
+  <w:style w:type="paragraph" w:styleId="user1">
     <w:name w:val="Указатель (user)"/>
     <w:basedOn w:val="Normal"/>
     <w:qFormat/>
@@ -8325,8 +8520,8 @@
       <w:rFonts w:cs="Arial"/>
     </w:rPr>
   </w:style>
-  <w:style w:type="paragraph" w:styleId="Style17" w:customStyle="1">
-    <w:name w:val="Содержимое таблицы"/>
+  <w:style w:type="paragraph" w:styleId="user2" w:customStyle="1">
+    <w:name w:val="Содержимое таблицы (user)"/>
     <w:basedOn w:val="Normal"/>
     <w:qFormat/>
     <w:rsid w:val="000d55fb"/>
@@ -8335,9 +8530,9 @@
     </w:pPr>
     <w:rPr/>
   </w:style>
-  <w:style w:type="paragraph" w:styleId="Style18" w:customStyle="1">
-    <w:name w:val="Заголовок таблицы"/>
-    <w:basedOn w:val="Style17"/>
+  <w:style w:type="paragraph" w:styleId="user3" w:customStyle="1">
+    <w:name w:val="Заголовок таблицы (user)"/>
+    <w:basedOn w:val="user2"/>
     <w:qFormat/>
     <w:rsid w:val="000d55fb"/>
     <w:pPr>
@@ -8366,29 +8561,29 @@
       <w:szCs w:val="16"/>
     </w:rPr>
   </w:style>
-  <w:style w:type="paragraph" w:styleId="user3">
-    <w:name w:val="Рисунок (user)"/>
+  <w:style w:type="paragraph" w:styleId="Style18">
+    <w:name w:val="Рисунок"/>
+    <w:basedOn w:val="Caption"/>
+    <w:qFormat/>
+    <w:pPr/>
+    <w:rPr/>
+  </w:style>
+  <w:style w:type="paragraph" w:styleId="Style19">
+    <w:name w:val="Текст"/>
     <w:basedOn w:val="Caption"/>
     <w:qFormat/>
     <w:pPr/>
     <w:rPr/>
   </w:style>
   <w:style w:type="paragraph" w:styleId="user4">
-    <w:name w:val="Текст (user)"/>
-    <w:basedOn w:val="Caption"/>
-    <w:qFormat/>
-    <w:pPr/>
-    <w:rPr/>
-  </w:style>
-  <w:style w:type="paragraph" w:styleId="Style19">
-    <w:name w:val="Содержимое врезки"/>
+    <w:name w:val="Содержимое врезки (user)"/>
     <w:basedOn w:val="Normal"/>
     <w:qFormat/>
     <w:pPr/>
     <w:rPr/>
   </w:style>
-  <w:style w:type="paragraph" w:styleId="Style20">
-    <w:name w:val="Колонтитулы"/>
+  <w:style w:type="paragraph" w:styleId="user5">
+    <w:name w:val="Колонтитулы (user)"/>
     <w:basedOn w:val="Normal"/>
     <w:qFormat/>
     <w:pPr>
@@ -8401,16 +8596,30 @@
     </w:pPr>
     <w:rPr/>
   </w:style>
+  <w:style w:type="paragraph" w:styleId="Style20">
+    <w:name w:val="Колонтитулы"/>
+    <w:basedOn w:val="Normal"/>
+    <w:qFormat/>
+    <w:pPr/>
+    <w:rPr/>
+  </w:style>
   <w:style w:type="paragraph" w:styleId="Footer">
     <w:name w:val="footer"/>
-    <w:basedOn w:val="Style20"/>
+    <w:basedOn w:val="user5"/>
     <w:pPr>
       <w:suppressLineNumbers/>
     </w:pPr>
     <w:rPr/>
   </w:style>
-  <w:style w:type="numbering" w:styleId="user5" w:default="1">
-    <w:name w:val="Без списка (user)"/>
+  <w:style w:type="paragraph" w:styleId="Style21">
+    <w:name w:val="Содержимое врезки"/>
+    <w:basedOn w:val="Normal"/>
+    <w:qFormat/>
+    <w:pPr/>
+    <w:rPr/>
+  </w:style>
+  <w:style w:type="numbering" w:styleId="Style22" w:default="1">
+    <w:name w:val="Без списка"/>
     <w:uiPriority w:val="99"/>
     <w:semiHidden/>
     <w:unhideWhenUsed/>

</xml_diff>